<commit_message>
fix: P11 escrow request includes assignment payment timing
</commit_message>
<xml_diff>
--- a/tools/candidates/portfolio-owner-pdf-20261013/13-raschet-metrami/54-zapros-sostoyanie-escrow.docx
+++ b/tools/candidates/portfolio-owner-pdf-20261013/13-raschet-metrami/54-zapros-sostoyanie-escrow.docx
@@ -538,70 +538,64 @@
           <w:sz w:val="24"/>
           <w:szCs w:val="24"/>
         </w:rPr>
-        <w:t xml:space="preserve">Документы просим направить в срок до </w:t>
-      </w:r>
-      <w:r>
-        <w:rPr>
-          <w:rFonts w:ascii="Times New Roman" w:cs="Times New Roman" w:eastAsia="Times New Roman" w:hAnsi="Times New Roman"/>
-          <w:b/>
-          <w:bCs/>
-          <w:i w:val="false"/>
-          <w:iCs w:val="false"/>
-          <w:color w:val="000000"/>
-          <w:sz w:val="24"/>
-          <w:szCs w:val="24"/>
-        </w:rPr>
-        <w:t xml:space="preserve">{{СРОК_ОТВЕТА_НА_ЗАПРОС}}</w:t>
-      </w:r>
-      <w:r>
-        <w:rPr>
-          <w:rFonts w:ascii="Times New Roman" w:cs="Times New Roman" w:eastAsia="Times New Roman" w:hAnsi="Times New Roman"/>
-          <w:sz w:val="24"/>
-          <w:szCs w:val="24"/>
-        </w:rPr>
-        <w:t xml:space="preserve"> на адрес </w:t>
-      </w:r>
-      <w:r>
-        <w:rPr>
-          <w:rFonts w:ascii="Times New Roman" w:cs="Times New Roman" w:eastAsia="Times New Roman" w:hAnsi="Times New Roman"/>
-          <w:b/>
-          <w:bCs/>
-          <w:i w:val="false"/>
-          <w:iCs w:val="false"/>
-          <w:color w:val="000000"/>
-          <w:sz w:val="24"/>
-          <w:szCs w:val="24"/>
-        </w:rPr>
-        <w:t xml:space="preserve">{{АДРЕС_ДЛЯ_ОТВЕТА}}</w:t>
-      </w:r>
-      <w:r>
-        <w:rPr>
-          <w:rFonts w:ascii="Times New Roman" w:cs="Times New Roman" w:eastAsia="Times New Roman" w:hAnsi="Times New Roman"/>
-          <w:sz w:val="24"/>
-          <w:szCs w:val="24"/>
-        </w:rPr>
-        <w:t xml:space="preserve"> либо на электронную почту </w:t>
-      </w:r>
-      <w:r>
-        <w:rPr>
-          <w:rFonts w:ascii="Times New Roman" w:cs="Times New Roman" w:eastAsia="Times New Roman" w:hAnsi="Times New Roman"/>
-          <w:b/>
-          <w:bCs/>
-          <w:i w:val="false"/>
-          <w:iCs w:val="false"/>
-          <w:color w:val="000000"/>
-          <w:sz w:val="24"/>
-          <w:szCs w:val="24"/>
-        </w:rPr>
-        <w:t xml:space="preserve">{{ЭЛЕКТРОННАЯ_ПОЧТА}}</w:t>
-      </w:r>
-      <w:r>
-        <w:rPr>
-          <w:rFonts w:ascii="Times New Roman" w:cs="Times New Roman" w:eastAsia="Times New Roman" w:hAnsi="Times New Roman"/>
-          <w:sz w:val="24"/>
-          <w:szCs w:val="24"/>
-        </w:rPr>
-        <w:t xml:space="preserve">.</w:t>
+        <w:t>3. Проект уступки: условия перехода долга по ДДУ, цена уступки и расчёт с цедентом. Если цедент — юридическое лицо, цена уступки оплачивается после госрегистрации соглашения (ч. 3 ст. 11 Закона № 214-ФЗ). При зачёте работ — основание и момент зачёта.</w:t>
+      </w:r>
+      <w:r>
+        <w:rPr>
+          <w:rFonts w:ascii="Times New Roman" w:cs="Times New Roman" w:eastAsia="Times New Roman" w:hAnsi="Times New Roman"/>
+          <w:b/>
+          <w:bCs/>
+          <w:i w:val="false"/>
+          <w:iCs w:val="false"/>
+          <w:color w:val="000000"/>
+          <w:sz w:val="24"/>
+          <w:szCs w:val="24"/>
+        </w:rPr>
+      </w:r>
+      <w:r>
+        <w:rPr>
+          <w:rFonts w:ascii="Times New Roman" w:cs="Times New Roman" w:eastAsia="Times New Roman" w:hAnsi="Times New Roman"/>
+          <w:sz w:val="24"/>
+          <w:szCs w:val="24"/>
+        </w:rPr>
+      </w:r>
+      <w:r>
+        <w:rPr>
+          <w:rFonts w:ascii="Times New Roman" w:cs="Times New Roman" w:eastAsia="Times New Roman" w:hAnsi="Times New Roman"/>
+          <w:b/>
+          <w:bCs/>
+          <w:i w:val="false"/>
+          <w:iCs w:val="false"/>
+          <w:color w:val="000000"/>
+          <w:sz w:val="24"/>
+          <w:szCs w:val="24"/>
+        </w:rPr>
+      </w:r>
+      <w:r>
+        <w:rPr>
+          <w:rFonts w:ascii="Times New Roman" w:cs="Times New Roman" w:eastAsia="Times New Roman" w:hAnsi="Times New Roman"/>
+          <w:sz w:val="24"/>
+          <w:szCs w:val="24"/>
+        </w:rPr>
+      </w:r>
+      <w:r>
+        <w:rPr>
+          <w:rFonts w:ascii="Times New Roman" w:cs="Times New Roman" w:eastAsia="Times New Roman" w:hAnsi="Times New Roman"/>
+          <w:b/>
+          <w:bCs/>
+          <w:i w:val="false"/>
+          <w:iCs w:val="false"/>
+          <w:color w:val="000000"/>
+          <w:sz w:val="24"/>
+          <w:szCs w:val="24"/>
+        </w:rPr>
+      </w:r>
+      <w:r>
+        <w:rPr>
+          <w:rFonts w:ascii="Times New Roman" w:cs="Times New Roman" w:eastAsia="Times New Roman" w:hAnsi="Times New Roman"/>
+          <w:sz w:val="24"/>
+          <w:szCs w:val="24"/>
+        </w:rPr>
       </w:r>
     </w:p>
     <w:p>
@@ -684,7 +678,7 @@
           <w:i/>
           <w:iCs/>
           <w:color w:val="595959"/>
-          <w:sz w:val="22"/>
+          <w:sz w:val="20"/>
           <w:szCs w:val="24"/>
         </w:rPr>
         <w:t xml:space="preserve">Примечание покупателю. Эта страница в отправляемое письмо не входит: отправляется только текст до разрыва страницы.</w:t>
@@ -694,14 +688,14 @@
       <w:pPr>
         <w:pStyle w:val="Heading2"/>
         <w:keepNext/>
-        <w:spacing w:after="120" w:before="260"/>
-      </w:pPr>
-      <w:r>
-        <w:rPr>
-          <w:rFonts w:ascii="Times New Roman" w:cs="Times New Roman" w:eastAsia="Times New Roman" w:hAnsi="Times New Roman"/>
-          <w:b/>
-          <w:bCs/>
-          <w:sz w:val="26"/>
+        <w:spacing w:after="60" w:before="260"/>
+      </w:pPr>
+      <w:r>
+        <w:rPr>
+          <w:rFonts w:ascii="Times New Roman" w:cs="Times New Roman" w:eastAsia="Times New Roman" w:hAnsi="Times New Roman"/>
+          <w:b/>
+          <w:bCs/>
+          <w:sz w:val="24"/>
           <w:szCs w:val="26"/>
         </w:rPr>
         <w:t xml:space="preserve">Назначение</w:t>
@@ -714,7 +708,7 @@
       <w:r>
         <w:rPr>
           <w:rFonts w:ascii="Times New Roman" w:cs="Times New Roman" w:eastAsia="Times New Roman" w:hAnsi="Times New Roman"/>
-          <w:sz w:val="22"/>
+          <w:sz w:val="20"/>
           <w:szCs w:val="24"/>
         </w:rPr>
         <w:t xml:space="preserve">Получить документальное подтверждение того, оплачен ли ДДУ, права по которому вам предлагают в счёт работ: открыт ли счёт эскроу, в каком банке, пополнен ли на цену договора. Подтверждение — справка или выписка банка. Письмо застройщика или цедента подтверждением не является: это заявление стороны, заинтересованной в сделке.</w:t>
@@ -727,7 +721,7 @@
       <w:r>
         <w:rPr>
           <w:rFonts w:ascii="Times New Roman" w:cs="Times New Roman" w:eastAsia="Times New Roman" w:hAnsi="Times New Roman"/>
-          <w:sz w:val="22"/>
+          <w:sz w:val="20"/>
           <w:szCs w:val="24"/>
         </w:rPr>
         <w:t>Ответ позволяет установить, какое право предлагают передать. При подтверждённом поступлении полной цены ДДУ на эскроу по ч. 3 ст. 15.4 Закона № 214-ФЗ проверяйте условия уступки оплаченного права. При неполной оплате нельзя считать обязанность доплатить автоматически перешедшей: требуется одновременный перевод долга с соблюдением требований ГК РФ, включая согласие кредитора. Сопоставьте ответ, ДДУ и проект уступки с памяткой «Читаем уступку: пункт об обязательствах по эскроу».</w:t>
@@ -737,17 +731,17 @@
       <w:pPr>
         <w:pStyle w:val="Heading2"/>
         <w:keepNext/>
-        <w:spacing w:after="120" w:before="260"/>
-      </w:pPr>
-      <w:r>
-        <w:rPr>
-          <w:rFonts w:ascii="Times New Roman" w:cs="Times New Roman" w:eastAsia="Times New Roman" w:hAnsi="Times New Roman"/>
-          <w:b/>
-          <w:bCs/>
-          <w:sz w:val="26"/>
+        <w:spacing w:after="60" w:before="260"/>
+      </w:pPr>
+      <w:r>
+        <w:rPr>
+          <w:rFonts w:ascii="Times New Roman" w:cs="Times New Roman" w:eastAsia="Times New Roman" w:hAnsi="Times New Roman"/>
+          <w:b/>
+          <w:bCs/>
+          <w:sz w:val="24"/>
           <w:szCs w:val="26"/>
         </w:rPr>
-        <w:t xml:space="preserve">Когда применяется</w:t>
+        <w:t>Сверьте оплату ДДУ по банковскому подтверждению (ч. 3 ст. 15.4 Закона № 214-ФЗ). При неполной оплате уступка требует одновременного перевода долга с соблюдением ГК РФ и согласия кредитора. Отдельно проверьте цену уступки: при цеденте — юридическом лице её уплата следует за госрегистрацией (ч. 3 ст. 11 Закона № 214-ФЗ). При зачёте работ проверьте встречные требования и момент зачёта: сам зачёт не подтверждает оплату ДДУ на эскроу.</w:t>
       </w:r>
     </w:p>
     <w:p>
@@ -757,7 +751,7 @@
       <w:r>
         <w:rPr>
           <w:rFonts w:ascii="Times New Roman" w:cs="Times New Roman" w:eastAsia="Times New Roman" w:hAnsi="Times New Roman"/>
-          <w:sz w:val="22"/>
+          <w:sz w:val="20"/>
           <w:szCs w:val="24"/>
         </w:rPr>
         <w:t xml:space="preserve">До подписания уступки или ДДУ — шаг 2 «Алгоритма: проверка расчёта метрами до входа». После подписания запрос не теряет смысла, но большинство ходов уже сделано: тогда его результат — материал для юриста, не для решения.</w:t>
@@ -767,14 +761,14 @@
       <w:pPr>
         <w:pStyle w:val="Heading2"/>
         <w:keepNext/>
-        <w:spacing w:after="120" w:before="260"/>
-      </w:pPr>
-      <w:r>
-        <w:rPr>
-          <w:rFonts w:ascii="Times New Roman" w:cs="Times New Roman" w:eastAsia="Times New Roman" w:hAnsi="Times New Roman"/>
-          <w:b/>
-          <w:bCs/>
-          <w:sz w:val="26"/>
+        <w:spacing w:after="60" w:before="260"/>
+      </w:pPr>
+      <w:r>
+        <w:rPr>
+          <w:rFonts w:ascii="Times New Roman" w:cs="Times New Roman" w:eastAsia="Times New Roman" w:hAnsi="Times New Roman"/>
+          <w:b/>
+          <w:bCs/>
+          <w:sz w:val="24"/>
           <w:szCs w:val="26"/>
         </w:rPr>
         <w:t xml:space="preserve">Кому адресуется</w:t>
@@ -787,7 +781,7 @@
       <w:r>
         <w:rPr>
           <w:rFonts w:ascii="Times New Roman" w:cs="Times New Roman" w:eastAsia="Times New Roman" w:hAnsi="Times New Roman"/>
-          <w:sz w:val="22"/>
+          <w:sz w:val="20"/>
           <w:szCs w:val="24"/>
         </w:rPr>
         <w:t xml:space="preserve">Банк по договору счёта эскроу отвечает его сторонам, а не будущему приобретателю права. Поэтому запрос направляется стороне сделки:</w:t>
@@ -805,7 +799,7 @@
       <w:r>
         <w:rPr>
           <w:rFonts w:ascii="Times New Roman" w:cs="Times New Roman" w:eastAsia="Times New Roman" w:hAnsi="Times New Roman"/>
-          <w:sz w:val="22"/>
+          <w:sz w:val="20"/>
           <w:szCs w:val="24"/>
         </w:rPr>
         <w:t xml:space="preserve">цеденту — текущему участнику долевого строительства, чьи права вам уступают: у него как у владельца счёта есть доступ к сведениям о нём;</w:t>
@@ -823,7 +817,7 @@
       <w:r>
         <w:rPr>
           <w:rFonts w:ascii="Times New Roman" w:cs="Times New Roman" w:eastAsia="Times New Roman" w:hAnsi="Times New Roman"/>
-          <w:sz w:val="22"/>
+          <w:sz w:val="20"/>
           <w:szCs w:val="24"/>
         </w:rPr>
         <w:t xml:space="preserve">застройщику — как стороне ДДУ и бенефициару счёта, с требованием предоставить справку банка;</w:t>
@@ -841,7 +835,7 @@
       <w:r>
         <w:rPr>
           <w:rFonts w:ascii="Times New Roman" w:cs="Times New Roman" w:eastAsia="Times New Roman" w:hAnsi="Times New Roman"/>
-          <w:sz w:val="22"/>
+          <w:sz w:val="20"/>
           <w:szCs w:val="24"/>
         </w:rPr>
         <w:t xml:space="preserve">при готовности сторон — совместное обращение в банк с вашим участием либо получение справки цедентом в вашем присутствии.</w:t>
@@ -854,7 +848,7 @@
       <w:r>
         <w:rPr>
           <w:rFonts w:ascii="Times New Roman" w:cs="Times New Roman" w:eastAsia="Times New Roman" w:hAnsi="Times New Roman"/>
-          <w:sz w:val="22"/>
+          <w:sz w:val="20"/>
           <w:szCs w:val="24"/>
         </w:rPr>
         <w:t>Отказ предоставить банковское подтверждение оплаты до подписания уступки — основание остановить согласование сделки и запросить документы об оплате и обязательствах по ДДУ.</w:t>
@@ -864,14 +858,14 @@
       <w:pPr>
         <w:pStyle w:val="Heading2"/>
         <w:keepNext/>
-        <w:spacing w:after="120" w:before="260"/>
-      </w:pPr>
-      <w:r>
-        <w:rPr>
-          <w:rFonts w:ascii="Times New Roman" w:cs="Times New Roman" w:eastAsia="Times New Roman" w:hAnsi="Times New Roman"/>
-          <w:b/>
-          <w:bCs/>
-          <w:sz w:val="26"/>
+        <w:spacing w:after="60" w:before="260"/>
+      </w:pPr>
+      <w:r>
+        <w:rPr>
+          <w:rFonts w:ascii="Times New Roman" w:cs="Times New Roman" w:eastAsia="Times New Roman" w:hAnsi="Times New Roman"/>
+          <w:b/>
+          <w:bCs/>
+          <w:sz w:val="24"/>
           <w:szCs w:val="26"/>
         </w:rPr>
         <w:t xml:space="preserve">Что подставить</w:t>
@@ -884,7 +878,7 @@
       <w:r>
         <w:rPr>
           <w:rFonts w:ascii="Times New Roman" w:cs="Times New Roman" w:eastAsia="Times New Roman" w:hAnsi="Times New Roman"/>
-          <w:sz w:val="22"/>
+          <w:sz w:val="20"/>
           <w:szCs w:val="24"/>
         </w:rPr>
         <w:t xml:space="preserve">По «Словарю полей» комплекта: реквизиты сторон, реквизиты ДДУ, предлагаемого к уступке, срок ответа (</w:t>
@@ -897,7 +891,7 @@
           <w:i w:val="false"/>
           <w:iCs w:val="false"/>
           <w:color w:val="000000"/>
-          <w:sz w:val="22"/>
+          <w:sz w:val="20"/>
           <w:szCs w:val="24"/>
         </w:rPr>
         <w:t xml:space="preserve">{{СРОК_ОТВЕТА_НА_ЗАПРОС}}</w:t>
@@ -905,7 +899,7 @@
       <w:r>
         <w:rPr>
           <w:rFonts w:ascii="Times New Roman" w:cs="Times New Roman" w:eastAsia="Times New Roman" w:hAnsi="Times New Roman"/>
-          <w:sz w:val="22"/>
+          <w:sz w:val="20"/>
           <w:szCs w:val="24"/>
         </w:rPr>
         <w:t xml:space="preserve"> — разумный рабочий; законом не установлен).</w:t>
@@ -915,14 +909,14 @@
       <w:pPr>
         <w:pStyle w:val="Heading2"/>
         <w:keepNext/>
-        <w:spacing w:after="120" w:before="260"/>
-      </w:pPr>
-      <w:r>
-        <w:rPr>
-          <w:rFonts w:ascii="Times New Roman" w:cs="Times New Roman" w:eastAsia="Times New Roman" w:hAnsi="Times New Roman"/>
-          <w:b/>
-          <w:bCs/>
-          <w:sz w:val="26"/>
+        <w:spacing w:after="60" w:before="260"/>
+      </w:pPr>
+      <w:r>
+        <w:rPr>
+          <w:rFonts w:ascii="Times New Roman" w:cs="Times New Roman" w:eastAsia="Times New Roman" w:hAnsi="Times New Roman"/>
+          <w:b/>
+          <w:bCs/>
+          <w:sz w:val="24"/>
           <w:szCs w:val="26"/>
         </w:rPr>
         <w:t>Порядок проверки документов</w:t>
@@ -940,7 +934,7 @@
       <w:r>
         <w:rPr>
           <w:rFonts w:ascii="Times New Roman" w:cs="Times New Roman" w:eastAsia="Times New Roman" w:hAnsi="Times New Roman"/>
-          <w:sz w:val="22"/>
+          <w:sz w:val="20"/>
           <w:szCs w:val="24"/>
         </w:rPr>
         <w:t>Сведения о счёте запрашивайте у сторон сделки; право будущего приобретателя получить их непосредственно в банке проверяется отдельно по полномочиям и документам.</w:t>
@@ -958,7 +952,7 @@
       <w:r>
         <w:rPr>
           <w:rFonts w:ascii="Times New Roman" w:cs="Times New Roman" w:eastAsia="Times New Roman" w:hAnsi="Times New Roman"/>
-          <w:sz w:val="22"/>
+          <w:sz w:val="20"/>
           <w:szCs w:val="24"/>
         </w:rPr>
         <w:t>Сопоставьте банковское подтверждение с самим ДДУ и проектом уступки: цену, сроки оплаты, условия перехода прав и обязанности по оплате (см. памятку «Читаем уступку: пункт об обязательствах по эскроу»).</w:t>
@@ -976,7 +970,7 @@
       <w:r>
         <w:rPr>
           <w:rFonts w:ascii="Times New Roman" w:cs="Times New Roman" w:eastAsia="Times New Roman" w:hAnsi="Times New Roman"/>
-          <w:sz w:val="22"/>
+          <w:sz w:val="20"/>
           <w:szCs w:val="24"/>
         </w:rPr>
         <w:t>Проверьте отдельно цену уступки и взаиморасчёты с цедентом: они не тождественны оплате цены ДДУ на счёт эскроу.</w:t>

</xml_diff>

<commit_message>
fix: restore P11 request 54 reply fields and START HERE route
Only two buyer candidate files; preserve existing legal wording and non-document ZIP parts. Add outgoing-only regression checks and exact-SHA correction receipt. Native Word/new buyer sign-off and release remain HOLD.
</commit_message>
<xml_diff>
--- a/tools/candidates/portfolio-owner-pdf-20261013/13-raschet-metrami/54-zapros-sostoyanie-escrow.docx
+++ b/tools/candidates/portfolio-owner-pdf-20261013/13-raschet-metrami/54-zapros-sostoyanie-escrow.docx
@@ -525,7 +525,7 @@
           <w:sz w:val="24"/>
           <w:szCs w:val="24"/>
         </w:rPr>
-        <w:t xml:space="preserve">3. Проект договора уступки с формулировкой пункта о судьбе обязательств по внесению денежных средств на счёт эскроу.</w:t>
+        <w:t xml:space="preserve">3. Проект уступки: условия перехода долга по ДДУ, цена уступки и расчёт с цедентом. Если цедент — юридическое лицо, цена уступки оплачивается после госрегистрации соглашения (ч. 3 ст. 11 Закона № 214-ФЗ). При зачёте работ — основание и момент зачёта.</w:t>
       </w:r>
     </w:p>
     <w:p>
@@ -538,7 +538,7 @@
           <w:sz w:val="24"/>
           <w:szCs w:val="24"/>
         </w:rPr>
-        <w:t>3. Проект уступки: условия перехода долга по ДДУ, цена уступки и расчёт с цедентом. Если цедент — юридическое лицо, цена уступки оплачивается после госрегистрации соглашения (ч. 3 ст. 11 Закона № 214-ФЗ). При зачёте работ — основание и момент зачёта.</w:t>
+        <w:t>Документы просим направить в срок до {{СРОК_ОТВЕТА_НА_ЗАПРОС}} на адрес {{АДРЕС_ДЛЯ_ОТВЕТА}} либо на электронную почту {{ЭЛЕКТРОННАЯ_ПОЧТА}}.</w:t>
       </w:r>
       <w:r>
         <w:rPr>
@@ -729,6 +729,19 @@
     </w:p>
     <w:p>
       <w:pPr>
+        <w:spacing w:after="40" w:line="276"/>
+      </w:pPr>
+      <w:r>
+        <w:rPr>
+          <w:rFonts w:ascii="Times New Roman" w:cs="Times New Roman" w:eastAsia="Times New Roman" w:hAnsi="Times New Roman"/>
+          <w:sz w:val="20"/>
+          <w:szCs w:val="24"/>
+        </w:rPr>
+        <w:t xml:space="preserve">Сверьте оплату ДДУ по банковскому подтверждению (ч. 3 ст. 15.4 Закона № 214-ФЗ). При неполной оплате уступка требует одновременного перевода долга с соблюдением ГК РФ и согласия кредитора. Отдельно проверьте цену уступки: при цеденте — юридическом лице её уплата следует за госрегистрацией (ч. 3 ст. 11 Закона № 214-ФЗ). При зачёте работ проверьте встречные требования и момент зачёта: сам зачёт не подтверждает оплату ДДУ на эскроу.</w:t>
+      </w:r>
+    </w:p>
+    <w:p>
+      <w:pPr>
         <w:pStyle w:val="Heading2"/>
         <w:keepNext/>
         <w:spacing w:after="60" w:before="260"/>
@@ -741,7 +754,7 @@
           <w:sz w:val="24"/>
           <w:szCs w:val="26"/>
         </w:rPr>
-        <w:t>Сверьте оплату ДДУ по банковскому подтверждению (ч. 3 ст. 15.4 Закона № 214-ФЗ). При неполной оплате уступка требует одновременного перевода долга с соблюдением ГК РФ и согласия кредитора. Отдельно проверьте цену уступки: при цеденте — юридическом лице её уплата следует за госрегистрацией (ч. 3 ст. 11 Закона № 214-ФЗ). При зачёте работ проверьте встречные требования и момент зачёта: сам зачёт не подтверждает оплату ДДУ на эскроу.</w:t>
+        <w:t xml:space="preserve">Когда применяется</w:t>
       </w:r>
     </w:p>
     <w:p>

</xml_diff>